<commit_message>
Refactoring: text in template file
</commit_message>
<xml_diff>
--- a/project/templates/report_template.docx
+++ b/project/templates/report_template.docx
@@ -43,7 +43,30 @@
           <w:sz w:val="24"/>
           <w:szCs w:val="24"/>
         </w:rPr>
-        <w:t>Data: {{REPORT_DATE}}</w:t>
+        <w:t>Data</w:t>
+      </w:r>
+      <w:r>
+        <w:rPr>
+          <w:sz w:val="24"/>
+          <w:szCs w:val="24"/>
+        </w:rPr>
+        <w:t xml:space="preserve"> </w:t>
+      </w:r>
+      <w:proofErr w:type="spellStart"/>
+      <w:r>
+        <w:rPr>
+          <w:sz w:val="24"/>
+          <w:szCs w:val="24"/>
+        </w:rPr>
+        <w:t>utworzenia</w:t>
+      </w:r>
+      <w:proofErr w:type="spellEnd"/>
+      <w:r>
+        <w:rPr>
+          <w:sz w:val="24"/>
+          <w:szCs w:val="24"/>
+        </w:rPr>
+        <w:t>: {{REPORT_DATE}}</w:t>
       </w:r>
     </w:p>
     <w:p>
@@ -119,11 +142,11 @@
         <w:tblLook w:val="04A0" w:firstRow="1" w:lastRow="0" w:firstColumn="1" w:lastColumn="0" w:noHBand="0" w:noVBand="1"/>
       </w:tblPr>
       <w:tblGrid>
-        <w:gridCol w:w="1771"/>
-        <w:gridCol w:w="2957"/>
-        <w:gridCol w:w="2023"/>
-        <w:gridCol w:w="1839"/>
-        <w:gridCol w:w="1888"/>
+        <w:gridCol w:w="1762"/>
+        <w:gridCol w:w="2971"/>
+        <w:gridCol w:w="1960"/>
+        <w:gridCol w:w="1840"/>
+        <w:gridCol w:w="1945"/>
       </w:tblGrid>
       <w:tr>
         <w:trPr>
@@ -137,12 +160,14 @@
             <w:pPr>
               <w:jc w:val="center"/>
               <w:rPr>
+                <w:rFonts w:ascii="Bahnschrift" w:hAnsi="Bahnschrift"/>
                 <w:sz w:val="24"/>
                 <w:szCs w:val="24"/>
               </w:rPr>
             </w:pPr>
             <w:r>
               <w:rPr>
+                <w:rFonts w:ascii="Bahnschrift" w:hAnsi="Bahnschrift"/>
                 <w:sz w:val="24"/>
                 <w:szCs w:val="24"/>
               </w:rPr>
@@ -158,12 +183,14 @@
             <w:pPr>
               <w:jc w:val="center"/>
               <w:rPr>
+                <w:rFonts w:ascii="Bahnschrift" w:hAnsi="Bahnschrift"/>
                 <w:sz w:val="24"/>
                 <w:szCs w:val="24"/>
               </w:rPr>
             </w:pPr>
             <w:r>
               <w:rPr>
+                <w:rFonts w:ascii="Bahnschrift" w:hAnsi="Bahnschrift"/>
                 <w:sz w:val="24"/>
                 <w:szCs w:val="24"/>
               </w:rPr>
@@ -179,12 +206,14 @@
             <w:pPr>
               <w:jc w:val="center"/>
               <w:rPr>
+                <w:rFonts w:ascii="Bahnschrift" w:hAnsi="Bahnschrift"/>
                 <w:sz w:val="24"/>
                 <w:szCs w:val="24"/>
               </w:rPr>
             </w:pPr>
             <w:r>
               <w:rPr>
+                <w:rFonts w:ascii="Bahnschrift" w:hAnsi="Bahnschrift"/>
                 <w:sz w:val="24"/>
                 <w:szCs w:val="24"/>
               </w:rPr>
@@ -200,12 +229,14 @@
             <w:pPr>
               <w:jc w:val="center"/>
               <w:rPr>
+                <w:rFonts w:ascii="Bahnschrift" w:hAnsi="Bahnschrift"/>
                 <w:sz w:val="24"/>
                 <w:szCs w:val="24"/>
               </w:rPr>
             </w:pPr>
             <w:r>
               <w:rPr>
+                <w:rFonts w:ascii="Bahnschrift" w:hAnsi="Bahnschrift"/>
                 <w:sz w:val="24"/>
                 <w:szCs w:val="24"/>
               </w:rPr>
@@ -221,6 +252,7 @@
             <w:pPr>
               <w:jc w:val="center"/>
               <w:rPr>
+                <w:rFonts w:ascii="Bahnschrift" w:hAnsi="Bahnschrift"/>
                 <w:sz w:val="24"/>
                 <w:szCs w:val="24"/>
               </w:rPr>
@@ -228,6 +260,7 @@
             <w:proofErr w:type="spellStart"/>
             <w:r>
               <w:rPr>
+                <w:rFonts w:ascii="Bahnschrift" w:hAnsi="Bahnschrift"/>
                 <w:sz w:val="24"/>
                 <w:szCs w:val="24"/>
               </w:rPr>
@@ -236,6 +269,7 @@
             <w:proofErr w:type="spellEnd"/>
             <w:r>
               <w:rPr>
+                <w:rFonts w:ascii="Bahnschrift" w:hAnsi="Bahnschrift"/>
                 <w:sz w:val="24"/>
                 <w:szCs w:val="24"/>
               </w:rPr>
@@ -244,6 +278,7 @@
             <w:proofErr w:type="spellStart"/>
             <w:r>
               <w:rPr>
+                <w:rFonts w:ascii="Bahnschrift" w:hAnsi="Bahnschrift"/>
                 <w:sz w:val="24"/>
                 <w:szCs w:val="24"/>
               </w:rPr>
@@ -252,6 +287,7 @@
             <w:proofErr w:type="spellEnd"/>
             <w:r>
               <w:rPr>
+                <w:rFonts w:ascii="Bahnschrift" w:hAnsi="Bahnschrift"/>
                 <w:sz w:val="24"/>
                 <w:szCs w:val="24"/>
               </w:rPr>
@@ -260,6 +296,7 @@
             <w:proofErr w:type="spellStart"/>
             <w:r>
               <w:rPr>
+                <w:rFonts w:ascii="Bahnschrift" w:hAnsi="Bahnschrift"/>
                 <w:sz w:val="24"/>
                 <w:szCs w:val="24"/>
               </w:rPr>
@@ -281,6 +318,7 @@
             <w:pPr>
               <w:jc w:val="center"/>
               <w:rPr>
+                <w:rFonts w:ascii="Bahnschrift" w:hAnsi="Bahnschrift"/>
                 <w:b/>
                 <w:bCs/>
                 <w:sz w:val="24"/>
@@ -289,6 +327,7 @@
             </w:pPr>
             <w:r>
               <w:rPr>
+                <w:rFonts w:ascii="Bahnschrift" w:hAnsi="Bahnschrift"/>
                 <w:b/>
                 <w:bCs/>
                 <w:sz w:val="24"/>
@@ -306,6 +345,7 @@
             <w:pPr>
               <w:jc w:val="center"/>
               <w:rPr>
+                <w:rFonts w:ascii="Bahnschrift" w:hAnsi="Bahnschrift"/>
                 <w:b/>
                 <w:bCs/>
                 <w:sz w:val="24"/>
@@ -314,6 +354,7 @@
             </w:pPr>
             <w:r>
               <w:rPr>
+                <w:rFonts w:ascii="Bahnschrift" w:hAnsi="Bahnschrift"/>
                 <w:b/>
                 <w:bCs/>
                 <w:sz w:val="24"/>
@@ -331,6 +372,7 @@
             <w:pPr>
               <w:jc w:val="center"/>
               <w:rPr>
+                <w:rFonts w:ascii="Bahnschrift" w:hAnsi="Bahnschrift"/>
                 <w:b/>
                 <w:bCs/>
                 <w:sz w:val="24"/>
@@ -339,6 +381,7 @@
             </w:pPr>
             <w:r>
               <w:rPr>
+                <w:rFonts w:ascii="Bahnschrift" w:hAnsi="Bahnschrift"/>
                 <w:b/>
                 <w:bCs/>
                 <w:sz w:val="24"/>
@@ -356,6 +399,7 @@
             <w:pPr>
               <w:jc w:val="center"/>
               <w:rPr>
+                <w:rFonts w:ascii="Bahnschrift" w:hAnsi="Bahnschrift"/>
                 <w:b/>
                 <w:bCs/>
                 <w:sz w:val="24"/>
@@ -364,6 +408,7 @@
             </w:pPr>
             <w:r>
               <w:rPr>
+                <w:rFonts w:ascii="Bahnschrift" w:hAnsi="Bahnschrift"/>
                 <w:b/>
                 <w:bCs/>
                 <w:sz w:val="24"/>
@@ -380,6 +425,7 @@
           <w:p>
             <w:pPr>
               <w:rPr>
+                <w:rFonts w:ascii="Bahnschrift" w:hAnsi="Bahnschrift"/>
                 <w:sz w:val="24"/>
                 <w:szCs w:val="24"/>
               </w:rPr>

</xml_diff>

<commit_message>
fix(report): remove duplicated description from shift_info in DOCX
</commit_message>
<xml_diff>
--- a/project/templates/report_template.docx
+++ b/project/templates/report_template.docx
@@ -21,27 +21,39 @@
     <w:p>
       <w:pPr>
         <w:jc w:val="center"/>
+        <w:rPr>
+          <w:lang w:val="pl-PL"/>
+        </w:rPr>
       </w:pPr>
       <w:r>
         <w:rPr>
           <w:b/>
           <w:sz w:val="24"/>
+          <w:lang w:val="pl-PL"/>
         </w:rPr>
         <w:t>{{SHIFT_INFO}}</w:t>
       </w:r>
     </w:p>
-    <w:p/>
+    <w:p>
+      <w:pPr>
+        <w:rPr>
+          <w:lang w:val="pl-PL"/>
+        </w:rPr>
+      </w:pPr>
+    </w:p>
     <w:p>
       <w:pPr>
         <w:rPr>
           <w:sz w:val="24"/>
           <w:szCs w:val="24"/>
+          <w:lang w:val="pl-PL"/>
         </w:rPr>
       </w:pPr>
       <w:r>
         <w:rPr>
           <w:sz w:val="24"/>
           <w:szCs w:val="24"/>
+          <w:lang w:val="pl-PL"/>
         </w:rPr>
         <w:t>Data</w:t>
       </w:r>
@@ -49,22 +61,15 @@
         <w:rPr>
           <w:sz w:val="24"/>
           <w:szCs w:val="24"/>
+          <w:lang w:val="pl-PL"/>
         </w:rPr>
-        <w:t xml:space="preserve"> </w:t>
+        <w:t xml:space="preserve"> utworzenia</w:t>
       </w:r>
-      <w:proofErr w:type="spellStart"/>
       <w:r>
         <w:rPr>
           <w:sz w:val="24"/>
           <w:szCs w:val="24"/>
-        </w:rPr>
-        <w:t>utworzenia</w:t>
-      </w:r>
-      <w:proofErr w:type="spellEnd"/>
-      <w:r>
-        <w:rPr>
-          <w:sz w:val="24"/>
-          <w:szCs w:val="24"/>
+          <w:lang w:val="pl-PL"/>
         </w:rPr>
         <w:t>: {{REPORT_DATE}}</w:t>
       </w:r>
@@ -74,23 +79,16 @@
         <w:rPr>
           <w:sz w:val="24"/>
           <w:szCs w:val="24"/>
+          <w:lang w:val="pl-PL"/>
         </w:rPr>
       </w:pPr>
-      <w:proofErr w:type="spellStart"/>
       <w:r>
         <w:rPr>
           <w:sz w:val="24"/>
           <w:szCs w:val="24"/>
+          <w:lang w:val="pl-PL"/>
         </w:rPr>
-        <w:t>Użytkownik</w:t>
-      </w:r>
-      <w:proofErr w:type="spellEnd"/>
-      <w:r>
-        <w:rPr>
-          <w:sz w:val="24"/>
-          <w:szCs w:val="24"/>
-        </w:rPr>
-        <w:t>: {{USER}}</w:t>
+        <w:t>Użytkownik: {{USER}}</w:t>
       </w:r>
     </w:p>
     <w:p>
@@ -98,43 +96,50 @@
         <w:rPr>
           <w:sz w:val="24"/>
           <w:szCs w:val="24"/>
+          <w:lang w:val="pl-PL"/>
         </w:rPr>
       </w:pPr>
-      <w:proofErr w:type="spellStart"/>
       <w:r>
         <w:rPr>
           <w:sz w:val="24"/>
           <w:szCs w:val="24"/>
+          <w:lang w:val="pl-PL"/>
         </w:rPr>
-        <w:t>Linia</w:t>
-      </w:r>
-      <w:proofErr w:type="spellEnd"/>
-      <w:r>
-        <w:rPr>
-          <w:sz w:val="24"/>
-          <w:szCs w:val="24"/>
-        </w:rPr>
-        <w:t>: {{LINE}}</w:t>
+        <w:t>Linia: {{LINE}}</w:t>
       </w:r>
     </w:p>
-    <w:p/>
     <w:p>
       <w:pPr>
         <w:rPr>
-          <w:sz w:val="24"/>
-          <w:szCs w:val="24"/>
+          <w:lang w:val="pl-PL"/>
+        </w:rPr>
+      </w:pPr>
+    </w:p>
+    <w:p>
+      <w:pPr>
+        <w:rPr>
+          <w:sz w:val="28"/>
+          <w:szCs w:val="28"/>
+          <w:lang w:val="pl-PL"/>
         </w:rPr>
       </w:pPr>
       <w:r>
         <w:rPr>
           <w:b/>
-          <w:sz w:val="28"/>
-          <w:szCs w:val="24"/>
+          <w:sz w:val="32"/>
+          <w:szCs w:val="28"/>
+          <w:lang w:val="pl-PL"/>
         </w:rPr>
         <w:t>{{MACHINE}}</w:t>
       </w:r>
     </w:p>
-    <w:p/>
+    <w:p>
+      <w:pPr>
+        <w:rPr>
+          <w:lang w:val="pl-PL"/>
+        </w:rPr>
+      </w:pPr>
+    </w:p>
     <w:tbl>
       <w:tblPr>
         <w:tblStyle w:val="Tabela-Siatka"/>
@@ -142,15 +147,15 @@
         <w:tblLook w:val="04A0" w:firstRow="1" w:lastRow="0" w:firstColumn="1" w:lastColumn="0" w:noHBand="0" w:noVBand="1"/>
       </w:tblPr>
       <w:tblGrid>
-        <w:gridCol w:w="1762"/>
-        <w:gridCol w:w="2971"/>
-        <w:gridCol w:w="1960"/>
-        <w:gridCol w:w="1840"/>
-        <w:gridCol w:w="1945"/>
+        <w:gridCol w:w="1730"/>
+        <w:gridCol w:w="2985"/>
+        <w:gridCol w:w="1925"/>
+        <w:gridCol w:w="1784"/>
+        <w:gridCol w:w="2054"/>
       </w:tblGrid>
       <w:tr>
         <w:trPr>
-          <w:trHeight w:val="397"/>
+          <w:trHeight w:val="567"/>
         </w:trPr>
         <w:tc>
           <w:tcPr>
@@ -160,16 +165,12 @@
             <w:pPr>
               <w:jc w:val="center"/>
               <w:rPr>
-                <w:rFonts w:ascii="Bahnschrift" w:hAnsi="Bahnschrift"/>
-                <w:sz w:val="24"/>
-                <w:szCs w:val="24"/>
+                <w:rStyle w:val="Pogrubienie"/>
               </w:rPr>
             </w:pPr>
             <w:r>
               <w:rPr>
-                <w:rFonts w:ascii="Bahnschrift" w:hAnsi="Bahnschrift"/>
-                <w:sz w:val="24"/>
-                <w:szCs w:val="24"/>
+                <w:rStyle w:val="Pogrubienie"/>
               </w:rPr>
               <w:t>LP</w:t>
             </w:r>
@@ -183,16 +184,12 @@
             <w:pPr>
               <w:jc w:val="center"/>
               <w:rPr>
-                <w:rFonts w:ascii="Bahnschrift" w:hAnsi="Bahnschrift"/>
-                <w:sz w:val="24"/>
-                <w:szCs w:val="24"/>
+                <w:rStyle w:val="Pogrubienie"/>
               </w:rPr>
             </w:pPr>
             <w:r>
               <w:rPr>
-                <w:rFonts w:ascii="Bahnschrift" w:hAnsi="Bahnschrift"/>
-                <w:sz w:val="24"/>
-                <w:szCs w:val="24"/>
+                <w:rStyle w:val="Pogrubienie"/>
               </w:rPr>
               <w:t>INDEKS</w:t>
             </w:r>
@@ -206,18 +203,20 @@
             <w:pPr>
               <w:jc w:val="center"/>
               <w:rPr>
-                <w:rFonts w:ascii="Bahnschrift" w:hAnsi="Bahnschrift"/>
-                <w:sz w:val="24"/>
-                <w:szCs w:val="24"/>
+                <w:rStyle w:val="Pogrubienie"/>
               </w:rPr>
             </w:pPr>
             <w:r>
               <w:rPr>
-                <w:rFonts w:ascii="Bahnschrift" w:hAnsi="Bahnschrift"/>
-                <w:sz w:val="24"/>
-                <w:szCs w:val="24"/>
+                <w:rStyle w:val="Pogrubienie"/>
               </w:rPr>
-              <w:t>ILOŚĆ w M.</w:t>
+              <w:t>ILOŚĆ w M</w:t>
+            </w:r>
+            <w:r>
+              <w:rPr>
+                <w:rStyle w:val="Pogrubienie"/>
+              </w:rPr>
+              <w:t>ETRACH</w:t>
             </w:r>
           </w:p>
         </w:tc>
@@ -229,18 +228,20 @@
             <w:pPr>
               <w:jc w:val="center"/>
               <w:rPr>
-                <w:rFonts w:ascii="Bahnschrift" w:hAnsi="Bahnschrift"/>
-                <w:sz w:val="24"/>
-                <w:szCs w:val="24"/>
+                <w:rStyle w:val="Pogrubienie"/>
               </w:rPr>
             </w:pPr>
             <w:r>
               <w:rPr>
-                <w:rFonts w:ascii="Bahnschrift" w:hAnsi="Bahnschrift"/>
-                <w:sz w:val="24"/>
-                <w:szCs w:val="24"/>
+                <w:rStyle w:val="Pogrubienie"/>
               </w:rPr>
-              <w:t>SZT.</w:t>
+              <w:t>ILOŚĆ w SZT</w:t>
+            </w:r>
+            <w:r>
+              <w:rPr>
+                <w:rStyle w:val="Pogrubienie"/>
+              </w:rPr>
+              <w:t>UKACH</w:t>
             </w:r>
           </w:p>
         </w:tc>
@@ -252,57 +253,15 @@
             <w:pPr>
               <w:jc w:val="center"/>
               <w:rPr>
-                <w:rFonts w:ascii="Bahnschrift" w:hAnsi="Bahnschrift"/>
-                <w:sz w:val="24"/>
-                <w:szCs w:val="24"/>
+                <w:rStyle w:val="Pogrubienie"/>
               </w:rPr>
             </w:pPr>
-            <w:proofErr w:type="spellStart"/>
             <w:r>
               <w:rPr>
-                <w:rFonts w:ascii="Bahnschrift" w:hAnsi="Bahnschrift"/>
-                <w:sz w:val="24"/>
-                <w:szCs w:val="24"/>
+                <w:rStyle w:val="Pogrubienie"/>
               </w:rPr>
-              <w:t>Ilość</w:t>
+              <w:t>ILOŚĆ PEŁNYCH PALET</w:t>
             </w:r>
-            <w:proofErr w:type="spellEnd"/>
-            <w:r>
-              <w:rPr>
-                <w:rFonts w:ascii="Bahnschrift" w:hAnsi="Bahnschrift"/>
-                <w:sz w:val="24"/>
-                <w:szCs w:val="24"/>
-              </w:rPr>
-              <w:t xml:space="preserve"> </w:t>
-            </w:r>
-            <w:proofErr w:type="spellStart"/>
-            <w:r>
-              <w:rPr>
-                <w:rFonts w:ascii="Bahnschrift" w:hAnsi="Bahnschrift"/>
-                <w:sz w:val="24"/>
-                <w:szCs w:val="24"/>
-              </w:rPr>
-              <w:t>pełnych</w:t>
-            </w:r>
-            <w:proofErr w:type="spellEnd"/>
-            <w:r>
-              <w:rPr>
-                <w:rFonts w:ascii="Bahnschrift" w:hAnsi="Bahnschrift"/>
-                <w:sz w:val="24"/>
-                <w:szCs w:val="24"/>
-              </w:rPr>
-              <w:t xml:space="preserve"> </w:t>
-            </w:r>
-            <w:proofErr w:type="spellStart"/>
-            <w:r>
-              <w:rPr>
-                <w:rFonts w:ascii="Bahnschrift" w:hAnsi="Bahnschrift"/>
-                <w:sz w:val="24"/>
-                <w:szCs w:val="24"/>
-              </w:rPr>
-              <w:t>palet</w:t>
-            </w:r>
-            <w:proofErr w:type="spellEnd"/>
           </w:p>
         </w:tc>
       </w:tr>
@@ -316,23 +275,9 @@
           </w:tcPr>
           <w:p>
             <w:pPr>
-              <w:jc w:val="center"/>
-              <w:rPr>
-                <w:rFonts w:ascii="Bahnschrift" w:hAnsi="Bahnschrift"/>
-                <w:b/>
-                <w:bCs/>
-                <w:sz w:val="24"/>
-                <w:szCs w:val="24"/>
-              </w:rPr>
+              <w:pStyle w:val="Bezodstpw"/>
             </w:pPr>
             <w:r>
-              <w:rPr>
-                <w:rFonts w:ascii="Bahnschrift" w:hAnsi="Bahnschrift"/>
-                <w:b/>
-                <w:bCs/>
-                <w:sz w:val="24"/>
-                <w:szCs w:val="24"/>
-              </w:rPr>
               <w:t>{{ROW_LP}}</w:t>
             </w:r>
           </w:p>
@@ -343,23 +288,9 @@
           </w:tcPr>
           <w:p>
             <w:pPr>
-              <w:jc w:val="center"/>
-              <w:rPr>
-                <w:rFonts w:ascii="Bahnschrift" w:hAnsi="Bahnschrift"/>
-                <w:b/>
-                <w:bCs/>
-                <w:sz w:val="24"/>
-                <w:szCs w:val="24"/>
-              </w:rPr>
+              <w:pStyle w:val="Bezodstpw"/>
             </w:pPr>
             <w:r>
-              <w:rPr>
-                <w:rFonts w:ascii="Bahnschrift" w:hAnsi="Bahnschrift"/>
-                <w:b/>
-                <w:bCs/>
-                <w:sz w:val="24"/>
-                <w:szCs w:val="24"/>
-              </w:rPr>
               <w:t>{{ROW_INDEX}}</w:t>
             </w:r>
           </w:p>
@@ -370,23 +301,9 @@
           </w:tcPr>
           <w:p>
             <w:pPr>
-              <w:jc w:val="center"/>
-              <w:rPr>
-                <w:rFonts w:ascii="Bahnschrift" w:hAnsi="Bahnschrift"/>
-                <w:b/>
-                <w:bCs/>
-                <w:sz w:val="24"/>
-                <w:szCs w:val="24"/>
-              </w:rPr>
+              <w:pStyle w:val="Bezodstpw"/>
             </w:pPr>
             <w:r>
-              <w:rPr>
-                <w:rFonts w:ascii="Bahnschrift" w:hAnsi="Bahnschrift"/>
-                <w:b/>
-                <w:bCs/>
-                <w:sz w:val="24"/>
-                <w:szCs w:val="24"/>
-              </w:rPr>
               <w:t>{{ROW_QTY_M}}</w:t>
             </w:r>
           </w:p>
@@ -397,23 +314,9 @@
           </w:tcPr>
           <w:p>
             <w:pPr>
-              <w:jc w:val="center"/>
-              <w:rPr>
-                <w:rFonts w:ascii="Bahnschrift" w:hAnsi="Bahnschrift"/>
-                <w:b/>
-                <w:bCs/>
-                <w:sz w:val="24"/>
-                <w:szCs w:val="24"/>
-              </w:rPr>
+              <w:pStyle w:val="Bezodstpw"/>
             </w:pPr>
             <w:r>
-              <w:rPr>
-                <w:rFonts w:ascii="Bahnschrift" w:hAnsi="Bahnschrift"/>
-                <w:b/>
-                <w:bCs/>
-                <w:sz w:val="24"/>
-                <w:szCs w:val="24"/>
-              </w:rPr>
               <w:t>{{ROW_PCS}}</w:t>
             </w:r>
           </w:p>

</xml_diff>

<commit_message>
Refactoring: change in appearance for report_template.docx
</commit_message>
<xml_diff>
--- a/project/templates/report_template.docx
+++ b/project/templates/report_template.docx
@@ -159,7 +159,7 @@
         </w:trPr>
         <w:tc>
           <w:tcPr>
-            <w:tcW w:w="624" w:type="dxa"/>
+            <w:tcW w:w="1730" w:type="dxa"/>
           </w:tcPr>
           <w:p>
             <w:pPr>
@@ -178,7 +178,7 @@
         </w:tc>
         <w:tc>
           <w:tcPr>
-            <w:tcW w:w="4082" w:type="dxa"/>
+            <w:tcW w:w="2985" w:type="dxa"/>
           </w:tcPr>
           <w:p>
             <w:pPr>
@@ -197,7 +197,7 @@
         </w:tc>
         <w:tc>
           <w:tcPr>
-            <w:tcW w:w="1814" w:type="dxa"/>
+            <w:tcW w:w="1925" w:type="dxa"/>
           </w:tcPr>
           <w:p>
             <w:pPr>
@@ -222,7 +222,7 @@
         </w:tc>
         <w:tc>
           <w:tcPr>
-            <w:tcW w:w="1247" w:type="dxa"/>
+            <w:tcW w:w="1784" w:type="dxa"/>
           </w:tcPr>
           <w:p>
             <w:pPr>
@@ -247,7 +247,7 @@
         </w:tc>
         <w:tc>
           <w:tcPr>
-            <w:tcW w:w="2835" w:type="dxa"/>
+            <w:tcW w:w="2054" w:type="dxa"/>
           </w:tcPr>
           <w:p>
             <w:pPr>
@@ -271,7 +271,7 @@
         </w:trPr>
         <w:tc>
           <w:tcPr>
-            <w:tcW w:w="2052" w:type="dxa"/>
+            <w:tcW w:w="1730" w:type="dxa"/>
           </w:tcPr>
           <w:p>
             <w:pPr>
@@ -284,7 +284,7 @@
         </w:tc>
         <w:tc>
           <w:tcPr>
-            <w:tcW w:w="2052" w:type="dxa"/>
+            <w:tcW w:w="2985" w:type="dxa"/>
           </w:tcPr>
           <w:p>
             <w:pPr>
@@ -297,7 +297,7 @@
         </w:tc>
         <w:tc>
           <w:tcPr>
-            <w:tcW w:w="2052" w:type="dxa"/>
+            <w:tcW w:w="1925" w:type="dxa"/>
           </w:tcPr>
           <w:p>
             <w:pPr>
@@ -310,7 +310,7 @@
         </w:tc>
         <w:tc>
           <w:tcPr>
-            <w:tcW w:w="2052" w:type="dxa"/>
+            <w:tcW w:w="1784" w:type="dxa"/>
           </w:tcPr>
           <w:p>
             <w:pPr>
@@ -323,7 +323,7 @@
         </w:tc>
         <w:tc>
           <w:tcPr>
-            <w:tcW w:w="2052" w:type="dxa"/>
+            <w:tcW w:w="2054" w:type="dxa"/>
           </w:tcPr>
           <w:p>
             <w:pPr>
@@ -337,9 +337,18 @@
         </w:tc>
       </w:tr>
     </w:tbl>
-    <w:p/>
     <w:p>
       <w:pPr>
+        <w:pBdr>
+          <w:bottom w:val="single" w:sz="6" w:space="1" w:color="auto"/>
+        </w:pBdr>
+      </w:pPr>
+    </w:p>
+    <w:p>
+      <w:pPr>
+        <w:tabs>
+          <w:tab w:val="left" w:pos="7655"/>
+        </w:tabs>
         <w:rPr>
           <w:lang w:val="pl-PL"/>
         </w:rPr>
@@ -349,6 +358,35 @@
           <w:lang w:val="pl-PL"/>
         </w:rPr>
         <w:t>Ilość palet kompletacyjnych:</w:t>
+      </w:r>
+      <w:r>
+        <w:rPr>
+          <w:lang w:val="pl-PL"/>
+        </w:rPr>
+        <w:tab/>
+      </w:r>
+      <w:r>
+        <w:rPr>
+          <w:lang w:val="pl-PL"/>
+        </w:rPr>
+        <w:t>SU</w:t>
+      </w:r>
+      <w:r>
+        <w:rPr>
+          <w:lang w:val="pl-PL"/>
+        </w:rPr>
+        <w:t>MA:</w:t>
+      </w:r>
+    </w:p>
+    <w:p>
+      <w:pPr>
+        <w:ind w:left="7200" w:firstLine="455"/>
+      </w:pPr>
+      <w:r>
+        <w:rPr>
+          <w:lang w:val="pl-PL"/>
+        </w:rPr>
+        <w:tab/>
       </w:r>
     </w:p>
     <w:p>

</xml_diff>